<commit_message>
Correct LAVAD sampling claim in deck, script and handbook (LAVAD samples every 16th frame too); add AnyAnomaly 80.7 on UCF-Crime; state metric sensitivity on UCF-Crime
</commit_message>
<xml_diff>
--- a/docs/06_presentations/DA-ZVAD_Phase3_Script.docx
+++ b/docs/06_presentations/DA-ZVAD_Phase3_Script.docx
@@ -9383,7 +9383,7 @@
           <w:color w:val="3A4A4C"/>
           <w:sz w:val="21"/>
         </w:rPr>
-        <w:t xml:space="preserve"> — "That's comparable or better, not a clean win — LAVAD scores every frame and I score every sixteenth."</w:t>
+        <w:t xml:space="preserve"> — "That's comparable or better, not a clean win — these are other papers' numbers, and small protocol details can move them. For context, AnyAnomaly gets 0.807 here — so on the most diverse benchmark, we're ahead of both."</w:t>
       </w:r>
     </w:p>
     <w:p>
@@ -9699,7 +9699,7 @@
           <w:color w:val="3A4A4C"/>
           <w:sz w:val="21"/>
         </w:rPr>
-        <w:t>Then the dashed line — LAVAD 0.803 — with the caveat once more: every frame versus every sixteenth.</w:t>
+        <w:t>Then the dashed line — LAVAD 0.803 — and say "comparable", not "better".</w:t>
       </w:r>
     </w:p>
     <w:p>
@@ -11633,29 +11633,29 @@
           <w:color w:val="141C1E"/>
           <w:sz w:val="21"/>
         </w:rPr>
-        <w:t>Protocol differences.</w:t>
-      </w:r>
-      <w:r>
-        <w:rPr>
-          <w:rFonts w:ascii="Georgia" w:hAnsi="Georgia"/>
-          <w:b w:val="0"/>
-          <w:i w:val="0"/>
-          <w:color w:val="3A4A4C"/>
-          <w:sz w:val="21"/>
-        </w:rPr>
-        <w:t xml:space="preserve"> UCF-Crime is scored every 16th frame where LAVAD scores every</w:t>
-      </w:r>
-    </w:p>
-    <w:p>
-      <w:r>
-        <w:rPr>
-          <w:rFonts w:ascii="Georgia" w:hAnsi="Georgia"/>
-          <w:b w:val="0"/>
-          <w:i w:val="0"/>
-          <w:color w:val="3A4A4C"/>
-          <w:sz w:val="21"/>
-        </w:rPr>
-        <w:t>frame, and each video's sentence comes from its first second of footage — in 3 of 140 crime videos the crime has already started then.</w:t>
+        <w:t>Metric sensitivity on UCF-Crime.</w:t>
+      </w:r>
+      <w:r>
+        <w:rPr>
+          <w:rFonts w:ascii="Georgia" w:hAnsi="Georgia"/>
+          <w:b w:val="0"/>
+          <w:i w:val="0"/>
+          <w:color w:val="3A4A4C"/>
+          <w:sz w:val="21"/>
+        </w:rPr>
+        <w:t xml:space="preserve"> Under the campus scoring method (per-video</w:t>
+      </w:r>
+    </w:p>
+    <w:p>
+      <w:r>
+        <w:rPr>
+          <w:rFonts w:ascii="Georgia" w:hAnsi="Georgia"/>
+          <w:b w:val="0"/>
+          <w:i w:val="0"/>
+          <w:color w:val="3A4A4C"/>
+          <w:sz w:val="21"/>
+        </w:rPr>
+        <w:t>normalisation) the context effect shrinks sharply — shared vs wrong-domain falls from +0.086 to +0.021. I report the raw metric because I registered it in advance, and I say the effect is not robust to the protocol. Also: each video's sentence comes from its first second, and in 3 of 140 crime videos the crime has already started then.</w:t>
       </w:r>
     </w:p>
     <w:p>
@@ -11804,7 +11804,7 @@
           <w:color w:val="141C1E"/>
           <w:sz w:val="21"/>
         </w:rPr>
-        <w:t xml:space="preserve"> Point at the box at the bottom first: the within-view control, the missing half of the mechanism, the per-camera sentences, and a whole new benchmark are done since Phase 2. Next is XD-Violence, the other benchmark LAVAD reports on; then patch-level scoring, my best shot at a higher number; then LLaVA's explanations; and UCF-Crime on every frame, to remove the one difference from LAVAD's protocol.</w:t>
+        <w:t xml:space="preserve"> Point at the box at the bottom first: the within-view control, the missing half of the mechanism, the per-camera sentences, and a whole new benchmark are done since Phase 2. Next is XD-Violence, the other benchmark LAVAD reports on; then patch-level scoring, my best shot at a higher number; then LLaVA's explanations; and UCF-Crime with scores spread to every frame, so the LAVAD comparison holds however they computed theirs.</w:t>
       </w:r>
     </w:p>
     <w:p>

</xml_diff>